<commit_message>
Interception marks, left control column, and repeat strikes
- Where a strike is shot down is now recorded on the attacker's map and
  persists across turns. The mark sits at the closest point on the flight path
  to the battery that fired it, so repeated marks triangulate enemy anti-air. A
  clear button wipes them when the map gets busy
- All controls moved into one left column: player, turn, budget, actions, the
  build/attack tabs, the active panel and End Turn, stacked vertically. The
  header is now just the title and the map keeps only its view controls
- Strikes can stack on a single cell. A second click adds another sortie rather
  than cancelling the first, so a known but well-defended target can be hit
  twice; removal moved to the strike plan list

Also records the deferred active/passive anti-air mechanic in GDD section 18,
alongside the other deferred decisions.

Co-Authored-By: Claude Opus 5 <noreply@anthropic.com>
</commit_message>
<xml_diff>
--- a/Battleship_2.0_GDD.docx
+++ b/Battleship_2.0_GDD.docx
@@ -4268,6 +4268,38 @@
       </w:pPr>
       <w:r>
         <w:t xml:space="preserve">'Desperation abilities' — special doctrine effects that activate only when the player is in trouble (e.g., a one-time defensive bonus when the capital takes damage) — were considered and deferred. Could add narrative drama and balance support if needed.</w:t>
+      </w:r>
+    </w:p>
+    <w:p>
+      <w:pPr>
+        <w:pStyle w:val="Heading2"/>
+      </w:pPr>
+      <w:r>
+        <w:t xml:space="preserve">Anti-Air Activation States</w:t>
+      </w:r>
+    </w:p>
+    <w:p>
+      <w:pPr>
+        <w:spacing w:after="120"/>
+      </w:pPr>
+      <w:r>
+        <w:t xml:space="preserve">Section 6 establishes that defense is an active investment rather than a passive state: without an action point spend, defenses sit at baseline readiness and engage incoming threats at reduced effectiveness. The prototype does not yet implement this. Batteries currently engage every strike crossing their envelope at full effectiveness, for free, which makes stacking anti-air the strongest available purchase — interception compounds multiplicatively while nothing pushes back against it.</w:t>
+      </w:r>
+    </w:p>
+    <w:p>
+      <w:pPr>
+        <w:spacing w:after="120"/>
+      </w:pPr>
+      <w:r>
+        <w:t xml:space="preserve">The proposed mechanic, deferred during the prototype economy pass, is a two-state battery. At baseline a battery intercepts at a low rate (roughly 15 percent). Spending one action point activates it for the coming turn, raising interception to its full rate (roughly 35 percent). Activation is chosen per battery during the player turn and holds until their next one, which makes defensive coverage a spatial decision each turn rather than a blanket property of owning batteries.</w:t>
+      </w:r>
+    </w:p>
+    <w:p>
+      <w:pPr>
+        <w:spacing w:after="120"/>
+      </w:pPr>
+      <w:r>
+        <w:t xml:space="preserve">This is expected to be the real answer to anti-air stacking, for the same reason a sortie limit per airfield answers command centre stacking: batteries a player cannot afford to activate contribute little, so quantity stops substituting for choice. It also delivers what Section 11 says the action budget is for — a genuine per-turn choice between striking and defending, which does not exist while attacking is the only thing action points buy. Until it is implemented, the prototype reduces anti-air engagement radius as a holding measure.</w:t>
       </w:r>
     </w:p>
     <w:p>

</xml_diff>